<commit_message>
feat: half-life compared in bioequivalence without a verdict
Half-life (LAMZHL) is not a bioequivalence endpoint. It is now reported as a
ratio with its confidence interval (useful in drug interaction studies)
but gets 'no verdict' and no acceptance limits (BE_NO_VERDICT_PARAMS in
R/be_analysis.R). The forest plot shows ratios without a verdict in grey
instead of dropping them, and its axis label follows the confidence level
of the run. Half-life is left out of the within-subject variability table.

Manual, URS (URS-BE-04), BE page text and version history updated.
Test REV3-14, failing first. Validation 330/330; protocol tables
regenerated (374 tests). Verified in the app on example_be_crossover.csv:
half-life 103.67% (101.68-105.70), 'no verdict'; Cmax and AUC keep YES;
four points in the forest plot.

Co-Authored-By: Claude Opus 5 <noreply@anthropic.com>
</commit_message>
<xml_diff>
--- a/NCA_Assistant_User_Manual_v1.5.docx
+++ b/NCA_Assistant_User_Manual_v1.5.docx
@@ -140,7 +140,7 @@
       <w:pPr>
         <w:pStyle w:val="Kop1"/>
       </w:pPr>
-      <w:bookmarkStart w:id="0" w:name="_Toc240576247"/>
+      <w:bookmarkStart w:id="0" w:name="_Toc240577077"/>
       <w:r>
         <w:lastRenderedPageBreak/>
         <w:t>Document Control</w:t>
@@ -890,7 +890,7 @@
       <w:pPr>
         <w:pStyle w:val="Kop1"/>
       </w:pPr>
-      <w:bookmarkStart w:id="1" w:name="_Toc240576248"/>
+      <w:bookmarkStart w:id="1" w:name="_Toc240577078"/>
       <w:r>
         <w:lastRenderedPageBreak/>
         <w:t>Table of Contents</w:t>
@@ -928,7 +928,7 @@
           <w:r>
             <w:fldChar w:fldCharType="separate"/>
           </w:r>
-          <w:hyperlink w:anchor="_Toc240576247" w:history="1">
+          <w:hyperlink w:anchor="_Toc240577077" w:history="1">
             <w:r>
               <w:rPr>
                 <w:rStyle w:val="Hyperlink"/>
@@ -952,7 +952,7 @@
               <w:rPr>
                 <w:noProof/>
               </w:rPr>
-              <w:instrText xml:space="preserve"> PAGEREF _Toc240576247 \h </w:instrText>
+              <w:instrText xml:space="preserve"> PAGEREF _Toc240577077 \h </w:instrText>
             </w:r>
             <w:r>
               <w:rPr>
@@ -994,7 +994,7 @@
               <w14:ligatures w14:val="standardContextual"/>
             </w:rPr>
           </w:pPr>
-          <w:hyperlink w:anchor="_Toc240576248" w:history="1">
+          <w:hyperlink w:anchor="_Toc240577078" w:history="1">
             <w:r>
               <w:rPr>
                 <w:rStyle w:val="Hyperlink"/>
@@ -1018,7 +1018,7 @@
               <w:rPr>
                 <w:noProof/>
               </w:rPr>
-              <w:instrText xml:space="preserve"> PAGEREF _Toc240576248 \h </w:instrText>
+              <w:instrText xml:space="preserve"> PAGEREF _Toc240577078 \h </w:instrText>
             </w:r>
             <w:r>
               <w:rPr>
@@ -1060,7 +1060,7 @@
               <w14:ligatures w14:val="standardContextual"/>
             </w:rPr>
           </w:pPr>
-          <w:hyperlink w:anchor="_Toc240576249" w:history="1">
+          <w:hyperlink w:anchor="_Toc240577079" w:history="1">
             <w:r>
               <w:rPr>
                 <w:rStyle w:val="Hyperlink"/>
@@ -1084,7 +1084,7 @@
               <w:rPr>
                 <w:noProof/>
               </w:rPr>
-              <w:instrText xml:space="preserve"> PAGEREF _Toc240576249 \h </w:instrText>
+              <w:instrText xml:space="preserve"> PAGEREF _Toc240577079 \h </w:instrText>
             </w:r>
             <w:r>
               <w:rPr>
@@ -1126,7 +1126,7 @@
               <w14:ligatures w14:val="standardContextual"/>
             </w:rPr>
           </w:pPr>
-          <w:hyperlink w:anchor="_Toc240576250" w:history="1">
+          <w:hyperlink w:anchor="_Toc240577080" w:history="1">
             <w:r>
               <w:rPr>
                 <w:rStyle w:val="Hyperlink"/>
@@ -1150,7 +1150,7 @@
               <w:rPr>
                 <w:noProof/>
               </w:rPr>
-              <w:instrText xml:space="preserve"> PAGEREF _Toc240576250 \h </w:instrText>
+              <w:instrText xml:space="preserve"> PAGEREF _Toc240577080 \h </w:instrText>
             </w:r>
             <w:r>
               <w:rPr>
@@ -1192,7 +1192,7 @@
               <w14:ligatures w14:val="standardContextual"/>
             </w:rPr>
           </w:pPr>
-          <w:hyperlink w:anchor="_Toc240576251" w:history="1">
+          <w:hyperlink w:anchor="_Toc240577081" w:history="1">
             <w:r>
               <w:rPr>
                 <w:rStyle w:val="Hyperlink"/>
@@ -1216,7 +1216,7 @@
               <w:rPr>
                 <w:noProof/>
               </w:rPr>
-              <w:instrText xml:space="preserve"> PAGEREF _Toc240576251 \h </w:instrText>
+              <w:instrText xml:space="preserve"> PAGEREF _Toc240577081 \h </w:instrText>
             </w:r>
             <w:r>
               <w:rPr>
@@ -1258,7 +1258,7 @@
               <w14:ligatures w14:val="standardContextual"/>
             </w:rPr>
           </w:pPr>
-          <w:hyperlink w:anchor="_Toc240576252" w:history="1">
+          <w:hyperlink w:anchor="_Toc240577082" w:history="1">
             <w:r>
               <w:rPr>
                 <w:rStyle w:val="Hyperlink"/>
@@ -1282,7 +1282,7 @@
               <w:rPr>
                 <w:noProof/>
               </w:rPr>
-              <w:instrText xml:space="preserve"> PAGEREF _Toc240576252 \h </w:instrText>
+              <w:instrText xml:space="preserve"> PAGEREF _Toc240577082 \h </w:instrText>
             </w:r>
             <w:r>
               <w:rPr>
@@ -1324,7 +1324,7 @@
               <w14:ligatures w14:val="standardContextual"/>
             </w:rPr>
           </w:pPr>
-          <w:hyperlink w:anchor="_Toc240576253" w:history="1">
+          <w:hyperlink w:anchor="_Toc240577083" w:history="1">
             <w:r>
               <w:rPr>
                 <w:rStyle w:val="Hyperlink"/>
@@ -1348,7 +1348,7 @@
               <w:rPr>
                 <w:noProof/>
               </w:rPr>
-              <w:instrText xml:space="preserve"> PAGEREF _Toc240576253 \h </w:instrText>
+              <w:instrText xml:space="preserve"> PAGEREF _Toc240577083 \h </w:instrText>
             </w:r>
             <w:r>
               <w:rPr>
@@ -1390,7 +1390,7 @@
               <w14:ligatures w14:val="standardContextual"/>
             </w:rPr>
           </w:pPr>
-          <w:hyperlink w:anchor="_Toc240576254" w:history="1">
+          <w:hyperlink w:anchor="_Toc240577084" w:history="1">
             <w:r>
               <w:rPr>
                 <w:rStyle w:val="Hyperlink"/>
@@ -1414,7 +1414,7 @@
               <w:rPr>
                 <w:noProof/>
               </w:rPr>
-              <w:instrText xml:space="preserve"> PAGEREF _Toc240576254 \h </w:instrText>
+              <w:instrText xml:space="preserve"> PAGEREF _Toc240577084 \h </w:instrText>
             </w:r>
             <w:r>
               <w:rPr>
@@ -1456,7 +1456,7 @@
               <w14:ligatures w14:val="standardContextual"/>
             </w:rPr>
           </w:pPr>
-          <w:hyperlink w:anchor="_Toc240576255" w:history="1">
+          <w:hyperlink w:anchor="_Toc240577085" w:history="1">
             <w:r>
               <w:rPr>
                 <w:rStyle w:val="Hyperlink"/>
@@ -1480,7 +1480,7 @@
               <w:rPr>
                 <w:noProof/>
               </w:rPr>
-              <w:instrText xml:space="preserve"> PAGEREF _Toc240576255 \h </w:instrText>
+              <w:instrText xml:space="preserve"> PAGEREF _Toc240577085 \h </w:instrText>
             </w:r>
             <w:r>
               <w:rPr>
@@ -1522,7 +1522,7 @@
               <w14:ligatures w14:val="standardContextual"/>
             </w:rPr>
           </w:pPr>
-          <w:hyperlink w:anchor="_Toc240576256" w:history="1">
+          <w:hyperlink w:anchor="_Toc240577086" w:history="1">
             <w:r>
               <w:rPr>
                 <w:rStyle w:val="Hyperlink"/>
@@ -1546,7 +1546,7 @@
               <w:rPr>
                 <w:noProof/>
               </w:rPr>
-              <w:instrText xml:space="preserve"> PAGEREF _Toc240576256 \h </w:instrText>
+              <w:instrText xml:space="preserve"> PAGEREF _Toc240577086 \h </w:instrText>
             </w:r>
             <w:r>
               <w:rPr>
@@ -1588,7 +1588,7 @@
               <w14:ligatures w14:val="standardContextual"/>
             </w:rPr>
           </w:pPr>
-          <w:hyperlink w:anchor="_Toc240576257" w:history="1">
+          <w:hyperlink w:anchor="_Toc240577087" w:history="1">
             <w:r>
               <w:rPr>
                 <w:rStyle w:val="Hyperlink"/>
@@ -1612,7 +1612,7 @@
               <w:rPr>
                 <w:noProof/>
               </w:rPr>
-              <w:instrText xml:space="preserve"> PAGEREF _Toc240576257 \h </w:instrText>
+              <w:instrText xml:space="preserve"> PAGEREF _Toc240577087 \h </w:instrText>
             </w:r>
             <w:r>
               <w:rPr>
@@ -1654,7 +1654,7 @@
               <w14:ligatures w14:val="standardContextual"/>
             </w:rPr>
           </w:pPr>
-          <w:hyperlink w:anchor="_Toc240576258" w:history="1">
+          <w:hyperlink w:anchor="_Toc240577088" w:history="1">
             <w:r>
               <w:rPr>
                 <w:rStyle w:val="Hyperlink"/>
@@ -1678,7 +1678,7 @@
               <w:rPr>
                 <w:noProof/>
               </w:rPr>
-              <w:instrText xml:space="preserve"> PAGEREF _Toc240576258 \h </w:instrText>
+              <w:instrText xml:space="preserve"> PAGEREF _Toc240577088 \h </w:instrText>
             </w:r>
             <w:r>
               <w:rPr>
@@ -1720,7 +1720,7 @@
               <w14:ligatures w14:val="standardContextual"/>
             </w:rPr>
           </w:pPr>
-          <w:hyperlink w:anchor="_Toc240576259" w:history="1">
+          <w:hyperlink w:anchor="_Toc240577089" w:history="1">
             <w:r>
               <w:rPr>
                 <w:rStyle w:val="Hyperlink"/>
@@ -1744,7 +1744,7 @@
               <w:rPr>
                 <w:noProof/>
               </w:rPr>
-              <w:instrText xml:space="preserve"> PAGEREF _Toc240576259 \h </w:instrText>
+              <w:instrText xml:space="preserve"> PAGEREF _Toc240577089 \h </w:instrText>
             </w:r>
             <w:r>
               <w:rPr>
@@ -1786,7 +1786,7 @@
               <w14:ligatures w14:val="standardContextual"/>
             </w:rPr>
           </w:pPr>
-          <w:hyperlink w:anchor="_Toc240576260" w:history="1">
+          <w:hyperlink w:anchor="_Toc240577090" w:history="1">
             <w:r>
               <w:rPr>
                 <w:rStyle w:val="Hyperlink"/>
@@ -1810,7 +1810,7 @@
               <w:rPr>
                 <w:noProof/>
               </w:rPr>
-              <w:instrText xml:space="preserve"> PAGEREF _Toc240576260 \h </w:instrText>
+              <w:instrText xml:space="preserve"> PAGEREF _Toc240577090 \h </w:instrText>
             </w:r>
             <w:r>
               <w:rPr>
@@ -1852,7 +1852,7 @@
               <w14:ligatures w14:val="standardContextual"/>
             </w:rPr>
           </w:pPr>
-          <w:hyperlink w:anchor="_Toc240576261" w:history="1">
+          <w:hyperlink w:anchor="_Toc240577091" w:history="1">
             <w:r>
               <w:rPr>
                 <w:rStyle w:val="Hyperlink"/>
@@ -1876,7 +1876,7 @@
               <w:rPr>
                 <w:noProof/>
               </w:rPr>
-              <w:instrText xml:space="preserve"> PAGEREF _Toc240576261 \h </w:instrText>
+              <w:instrText xml:space="preserve"> PAGEREF _Toc240577091 \h </w:instrText>
             </w:r>
             <w:r>
               <w:rPr>
@@ -1918,7 +1918,7 @@
               <w14:ligatures w14:val="standardContextual"/>
             </w:rPr>
           </w:pPr>
-          <w:hyperlink w:anchor="_Toc240576262" w:history="1">
+          <w:hyperlink w:anchor="_Toc240577092" w:history="1">
             <w:r>
               <w:rPr>
                 <w:rStyle w:val="Hyperlink"/>
@@ -1942,7 +1942,7 @@
               <w:rPr>
                 <w:noProof/>
               </w:rPr>
-              <w:instrText xml:space="preserve"> PAGEREF _Toc240576262 \h </w:instrText>
+              <w:instrText xml:space="preserve"> PAGEREF _Toc240577092 \h </w:instrText>
             </w:r>
             <w:r>
               <w:rPr>
@@ -1984,7 +1984,7 @@
               <w14:ligatures w14:val="standardContextual"/>
             </w:rPr>
           </w:pPr>
-          <w:hyperlink w:anchor="_Toc240576263" w:history="1">
+          <w:hyperlink w:anchor="_Toc240577093" w:history="1">
             <w:r>
               <w:rPr>
                 <w:rStyle w:val="Hyperlink"/>
@@ -2008,7 +2008,7 @@
               <w:rPr>
                 <w:noProof/>
               </w:rPr>
-              <w:instrText xml:space="preserve"> PAGEREF _Toc240576263 \h </w:instrText>
+              <w:instrText xml:space="preserve"> PAGEREF _Toc240577093 \h </w:instrText>
             </w:r>
             <w:r>
               <w:rPr>
@@ -2050,7 +2050,7 @@
               <w14:ligatures w14:val="standardContextual"/>
             </w:rPr>
           </w:pPr>
-          <w:hyperlink w:anchor="_Toc240576264" w:history="1">
+          <w:hyperlink w:anchor="_Toc240577094" w:history="1">
             <w:r>
               <w:rPr>
                 <w:rStyle w:val="Hyperlink"/>
@@ -2074,7 +2074,7 @@
               <w:rPr>
                 <w:noProof/>
               </w:rPr>
-              <w:instrText xml:space="preserve"> PAGEREF _Toc240576264 \h </w:instrText>
+              <w:instrText xml:space="preserve"> PAGEREF _Toc240577094 \h </w:instrText>
             </w:r>
             <w:r>
               <w:rPr>
@@ -2116,7 +2116,7 @@
               <w14:ligatures w14:val="standardContextual"/>
             </w:rPr>
           </w:pPr>
-          <w:hyperlink w:anchor="_Toc240576265" w:history="1">
+          <w:hyperlink w:anchor="_Toc240577095" w:history="1">
             <w:r>
               <w:rPr>
                 <w:rStyle w:val="Hyperlink"/>
@@ -2140,7 +2140,7 @@
               <w:rPr>
                 <w:noProof/>
               </w:rPr>
-              <w:instrText xml:space="preserve"> PAGEREF _Toc240576265 \h </w:instrText>
+              <w:instrText xml:space="preserve"> PAGEREF _Toc240577095 \h </w:instrText>
             </w:r>
             <w:r>
               <w:rPr>
@@ -2182,7 +2182,7 @@
               <w14:ligatures w14:val="standardContextual"/>
             </w:rPr>
           </w:pPr>
-          <w:hyperlink w:anchor="_Toc240576266" w:history="1">
+          <w:hyperlink w:anchor="_Toc240577096" w:history="1">
             <w:r>
               <w:rPr>
                 <w:rStyle w:val="Hyperlink"/>
@@ -2206,7 +2206,7 @@
               <w:rPr>
                 <w:noProof/>
               </w:rPr>
-              <w:instrText xml:space="preserve"> PAGEREF _Toc240576266 \h </w:instrText>
+              <w:instrText xml:space="preserve"> PAGEREF _Toc240577096 \h </w:instrText>
             </w:r>
             <w:r>
               <w:rPr>
@@ -2248,7 +2248,7 @@
               <w14:ligatures w14:val="standardContextual"/>
             </w:rPr>
           </w:pPr>
-          <w:hyperlink w:anchor="_Toc240576267" w:history="1">
+          <w:hyperlink w:anchor="_Toc240577097" w:history="1">
             <w:r>
               <w:rPr>
                 <w:rStyle w:val="Hyperlink"/>
@@ -2272,7 +2272,7 @@
               <w:rPr>
                 <w:noProof/>
               </w:rPr>
-              <w:instrText xml:space="preserve"> PAGEREF _Toc240576267 \h </w:instrText>
+              <w:instrText xml:space="preserve"> PAGEREF _Toc240577097 \h </w:instrText>
             </w:r>
             <w:r>
               <w:rPr>
@@ -2314,7 +2314,7 @@
               <w14:ligatures w14:val="standardContextual"/>
             </w:rPr>
           </w:pPr>
-          <w:hyperlink w:anchor="_Toc240576268" w:history="1">
+          <w:hyperlink w:anchor="_Toc240577098" w:history="1">
             <w:r>
               <w:rPr>
                 <w:rStyle w:val="Hyperlink"/>
@@ -2338,7 +2338,7 @@
               <w:rPr>
                 <w:noProof/>
               </w:rPr>
-              <w:instrText xml:space="preserve"> PAGEREF _Toc240576268 \h </w:instrText>
+              <w:instrText xml:space="preserve"> PAGEREF _Toc240577098 \h </w:instrText>
             </w:r>
             <w:r>
               <w:rPr>
@@ -2380,7 +2380,7 @@
               <w14:ligatures w14:val="standardContextual"/>
             </w:rPr>
           </w:pPr>
-          <w:hyperlink w:anchor="_Toc240576269" w:history="1">
+          <w:hyperlink w:anchor="_Toc240577099" w:history="1">
             <w:r>
               <w:rPr>
                 <w:rStyle w:val="Hyperlink"/>
@@ -2404,7 +2404,7 @@
               <w:rPr>
                 <w:noProof/>
               </w:rPr>
-              <w:instrText xml:space="preserve"> PAGEREF _Toc240576269 \h </w:instrText>
+              <w:instrText xml:space="preserve"> PAGEREF _Toc240577099 \h </w:instrText>
             </w:r>
             <w:r>
               <w:rPr>
@@ -2446,7 +2446,7 @@
               <w14:ligatures w14:val="standardContextual"/>
             </w:rPr>
           </w:pPr>
-          <w:hyperlink w:anchor="_Toc240576270" w:history="1">
+          <w:hyperlink w:anchor="_Toc240577100" w:history="1">
             <w:r>
               <w:rPr>
                 <w:rStyle w:val="Hyperlink"/>
@@ -2470,7 +2470,7 @@
               <w:rPr>
                 <w:noProof/>
               </w:rPr>
-              <w:instrText xml:space="preserve"> PAGEREF _Toc240576270 \h </w:instrText>
+              <w:instrText xml:space="preserve"> PAGEREF _Toc240577100 \h </w:instrText>
             </w:r>
             <w:r>
               <w:rPr>
@@ -2512,7 +2512,7 @@
               <w14:ligatures w14:val="standardContextual"/>
             </w:rPr>
           </w:pPr>
-          <w:hyperlink w:anchor="_Toc240576271" w:history="1">
+          <w:hyperlink w:anchor="_Toc240577101" w:history="1">
             <w:r>
               <w:rPr>
                 <w:rStyle w:val="Hyperlink"/>
@@ -2536,7 +2536,7 @@
               <w:rPr>
                 <w:noProof/>
               </w:rPr>
-              <w:instrText xml:space="preserve"> PAGEREF _Toc240576271 \h </w:instrText>
+              <w:instrText xml:space="preserve"> PAGEREF _Toc240577101 \h </w:instrText>
             </w:r>
             <w:r>
               <w:rPr>
@@ -2578,7 +2578,7 @@
               <w14:ligatures w14:val="standardContextual"/>
             </w:rPr>
           </w:pPr>
-          <w:hyperlink w:anchor="_Toc240576272" w:history="1">
+          <w:hyperlink w:anchor="_Toc240577102" w:history="1">
             <w:r>
               <w:rPr>
                 <w:rStyle w:val="Hyperlink"/>
@@ -2602,7 +2602,7 @@
               <w:rPr>
                 <w:noProof/>
               </w:rPr>
-              <w:instrText xml:space="preserve"> PAGEREF _Toc240576272 \h </w:instrText>
+              <w:instrText xml:space="preserve"> PAGEREF _Toc240577102 \h </w:instrText>
             </w:r>
             <w:r>
               <w:rPr>
@@ -2644,7 +2644,7 @@
               <w14:ligatures w14:val="standardContextual"/>
             </w:rPr>
           </w:pPr>
-          <w:hyperlink w:anchor="_Toc240576273" w:history="1">
+          <w:hyperlink w:anchor="_Toc240577103" w:history="1">
             <w:r>
               <w:rPr>
                 <w:rStyle w:val="Hyperlink"/>
@@ -2668,7 +2668,7 @@
               <w:rPr>
                 <w:noProof/>
               </w:rPr>
-              <w:instrText xml:space="preserve"> PAGEREF _Toc240576273 \h </w:instrText>
+              <w:instrText xml:space="preserve"> PAGEREF _Toc240577103 \h </w:instrText>
             </w:r>
             <w:r>
               <w:rPr>
@@ -2710,7 +2710,7 @@
               <w14:ligatures w14:val="standardContextual"/>
             </w:rPr>
           </w:pPr>
-          <w:hyperlink w:anchor="_Toc240576274" w:history="1">
+          <w:hyperlink w:anchor="_Toc240577104" w:history="1">
             <w:r>
               <w:rPr>
                 <w:rStyle w:val="Hyperlink"/>
@@ -2734,7 +2734,7 @@
               <w:rPr>
                 <w:noProof/>
               </w:rPr>
-              <w:instrText xml:space="preserve"> PAGEREF _Toc240576274 \h </w:instrText>
+              <w:instrText xml:space="preserve"> PAGEREF _Toc240577104 \h </w:instrText>
             </w:r>
             <w:r>
               <w:rPr>
@@ -2776,7 +2776,7 @@
               <w14:ligatures w14:val="standardContextual"/>
             </w:rPr>
           </w:pPr>
-          <w:hyperlink w:anchor="_Toc240576275" w:history="1">
+          <w:hyperlink w:anchor="_Toc240577105" w:history="1">
             <w:r>
               <w:rPr>
                 <w:rStyle w:val="Hyperlink"/>
@@ -2800,7 +2800,7 @@
               <w:rPr>
                 <w:noProof/>
               </w:rPr>
-              <w:instrText xml:space="preserve"> PAGEREF _Toc240576275 \h </w:instrText>
+              <w:instrText xml:space="preserve"> PAGEREF _Toc240577105 \h </w:instrText>
             </w:r>
             <w:r>
               <w:rPr>
@@ -2842,7 +2842,7 @@
               <w14:ligatures w14:val="standardContextual"/>
             </w:rPr>
           </w:pPr>
-          <w:hyperlink w:anchor="_Toc240576276" w:history="1">
+          <w:hyperlink w:anchor="_Toc240577106" w:history="1">
             <w:r>
               <w:rPr>
                 <w:rStyle w:val="Hyperlink"/>
@@ -2866,7 +2866,7 @@
               <w:rPr>
                 <w:noProof/>
               </w:rPr>
-              <w:instrText xml:space="preserve"> PAGEREF _Toc240576276 \h </w:instrText>
+              <w:instrText xml:space="preserve"> PAGEREF _Toc240577106 \h </w:instrText>
             </w:r>
             <w:r>
               <w:rPr>
@@ -2908,7 +2908,7 @@
               <w14:ligatures w14:val="standardContextual"/>
             </w:rPr>
           </w:pPr>
-          <w:hyperlink w:anchor="_Toc240576277" w:history="1">
+          <w:hyperlink w:anchor="_Toc240577107" w:history="1">
             <w:r>
               <w:rPr>
                 <w:rStyle w:val="Hyperlink"/>
@@ -2932,7 +2932,7 @@
               <w:rPr>
                 <w:noProof/>
               </w:rPr>
-              <w:instrText xml:space="preserve"> PAGEREF _Toc240576277 \h </w:instrText>
+              <w:instrText xml:space="preserve"> PAGEREF _Toc240577107 \h </w:instrText>
             </w:r>
             <w:r>
               <w:rPr>
@@ -2974,7 +2974,7 @@
               <w14:ligatures w14:val="standardContextual"/>
             </w:rPr>
           </w:pPr>
-          <w:hyperlink w:anchor="_Toc240576278" w:history="1">
+          <w:hyperlink w:anchor="_Toc240577108" w:history="1">
             <w:r>
               <w:rPr>
                 <w:rStyle w:val="Hyperlink"/>
@@ -2998,7 +2998,7 @@
               <w:rPr>
                 <w:noProof/>
               </w:rPr>
-              <w:instrText xml:space="preserve"> PAGEREF _Toc240576278 \h </w:instrText>
+              <w:instrText xml:space="preserve"> PAGEREF _Toc240577108 \h </w:instrText>
             </w:r>
             <w:r>
               <w:rPr>
@@ -3040,7 +3040,7 @@
               <w14:ligatures w14:val="standardContextual"/>
             </w:rPr>
           </w:pPr>
-          <w:hyperlink w:anchor="_Toc240576279" w:history="1">
+          <w:hyperlink w:anchor="_Toc240577109" w:history="1">
             <w:r>
               <w:rPr>
                 <w:rStyle w:val="Hyperlink"/>
@@ -3064,7 +3064,7 @@
               <w:rPr>
                 <w:noProof/>
               </w:rPr>
-              <w:instrText xml:space="preserve"> PAGEREF _Toc240576279 \h </w:instrText>
+              <w:instrText xml:space="preserve"> PAGEREF _Toc240577109 \h </w:instrText>
             </w:r>
             <w:r>
               <w:rPr>
@@ -3106,7 +3106,7 @@
               <w14:ligatures w14:val="standardContextual"/>
             </w:rPr>
           </w:pPr>
-          <w:hyperlink w:anchor="_Toc240576280" w:history="1">
+          <w:hyperlink w:anchor="_Toc240577110" w:history="1">
             <w:r>
               <w:rPr>
                 <w:rStyle w:val="Hyperlink"/>
@@ -3130,7 +3130,7 @@
               <w:rPr>
                 <w:noProof/>
               </w:rPr>
-              <w:instrText xml:space="preserve"> PAGEREF _Toc240576280 \h </w:instrText>
+              <w:instrText xml:space="preserve"> PAGEREF _Toc240577110 \h </w:instrText>
             </w:r>
             <w:r>
               <w:rPr>
@@ -3172,7 +3172,7 @@
               <w14:ligatures w14:val="standardContextual"/>
             </w:rPr>
           </w:pPr>
-          <w:hyperlink w:anchor="_Toc240576281" w:history="1">
+          <w:hyperlink w:anchor="_Toc240577111" w:history="1">
             <w:r>
               <w:rPr>
                 <w:rStyle w:val="Hyperlink"/>
@@ -3196,7 +3196,7 @@
               <w:rPr>
                 <w:noProof/>
               </w:rPr>
-              <w:instrText xml:space="preserve"> PAGEREF _Toc240576281 \h </w:instrText>
+              <w:instrText xml:space="preserve"> PAGEREF _Toc240577111 \h </w:instrText>
             </w:r>
             <w:r>
               <w:rPr>
@@ -3238,7 +3238,7 @@
               <w14:ligatures w14:val="standardContextual"/>
             </w:rPr>
           </w:pPr>
-          <w:hyperlink w:anchor="_Toc240576282" w:history="1">
+          <w:hyperlink w:anchor="_Toc240577112" w:history="1">
             <w:r>
               <w:rPr>
                 <w:rStyle w:val="Hyperlink"/>
@@ -3262,7 +3262,7 @@
               <w:rPr>
                 <w:noProof/>
               </w:rPr>
-              <w:instrText xml:space="preserve"> PAGEREF _Toc240576282 \h </w:instrText>
+              <w:instrText xml:space="preserve"> PAGEREF _Toc240577112 \h </w:instrText>
             </w:r>
             <w:r>
               <w:rPr>
@@ -3304,7 +3304,7 @@
               <w14:ligatures w14:val="standardContextual"/>
             </w:rPr>
           </w:pPr>
-          <w:hyperlink w:anchor="_Toc240576283" w:history="1">
+          <w:hyperlink w:anchor="_Toc240577113" w:history="1">
             <w:r>
               <w:rPr>
                 <w:rStyle w:val="Hyperlink"/>
@@ -3328,7 +3328,7 @@
               <w:rPr>
                 <w:noProof/>
               </w:rPr>
-              <w:instrText xml:space="preserve"> PAGEREF _Toc240576283 \h </w:instrText>
+              <w:instrText xml:space="preserve"> PAGEREF _Toc240577113 \h </w:instrText>
             </w:r>
             <w:r>
               <w:rPr>
@@ -3370,7 +3370,7 @@
               <w14:ligatures w14:val="standardContextual"/>
             </w:rPr>
           </w:pPr>
-          <w:hyperlink w:anchor="_Toc240576284" w:history="1">
+          <w:hyperlink w:anchor="_Toc240577114" w:history="1">
             <w:r>
               <w:rPr>
                 <w:rStyle w:val="Hyperlink"/>
@@ -3394,7 +3394,7 @@
               <w:rPr>
                 <w:noProof/>
               </w:rPr>
-              <w:instrText xml:space="preserve"> PAGEREF _Toc240576284 \h </w:instrText>
+              <w:instrText xml:space="preserve"> PAGEREF _Toc240577114 \h </w:instrText>
             </w:r>
             <w:r>
               <w:rPr>
@@ -3436,7 +3436,7 @@
               <w14:ligatures w14:val="standardContextual"/>
             </w:rPr>
           </w:pPr>
-          <w:hyperlink w:anchor="_Toc240576285" w:history="1">
+          <w:hyperlink w:anchor="_Toc240577115" w:history="1">
             <w:r>
               <w:rPr>
                 <w:rStyle w:val="Hyperlink"/>
@@ -3460,7 +3460,7 @@
               <w:rPr>
                 <w:noProof/>
               </w:rPr>
-              <w:instrText xml:space="preserve"> PAGEREF _Toc240576285 \h </w:instrText>
+              <w:instrText xml:space="preserve"> PAGEREF _Toc240577115 \h </w:instrText>
             </w:r>
             <w:r>
               <w:rPr>
@@ -3502,7 +3502,7 @@
               <w14:ligatures w14:val="standardContextual"/>
             </w:rPr>
           </w:pPr>
-          <w:hyperlink w:anchor="_Toc240576286" w:history="1">
+          <w:hyperlink w:anchor="_Toc240577116" w:history="1">
             <w:r>
               <w:rPr>
                 <w:rStyle w:val="Hyperlink"/>
@@ -3526,7 +3526,7 @@
               <w:rPr>
                 <w:noProof/>
               </w:rPr>
-              <w:instrText xml:space="preserve"> PAGEREF _Toc240576286 \h </w:instrText>
+              <w:instrText xml:space="preserve"> PAGEREF _Toc240577116 \h </w:instrText>
             </w:r>
             <w:r>
               <w:rPr>
@@ -3568,7 +3568,7 @@
               <w14:ligatures w14:val="standardContextual"/>
             </w:rPr>
           </w:pPr>
-          <w:hyperlink w:anchor="_Toc240576287" w:history="1">
+          <w:hyperlink w:anchor="_Toc240577117" w:history="1">
             <w:r>
               <w:rPr>
                 <w:rStyle w:val="Hyperlink"/>
@@ -3592,7 +3592,7 @@
               <w:rPr>
                 <w:noProof/>
               </w:rPr>
-              <w:instrText xml:space="preserve"> PAGEREF _Toc240576287 \h </w:instrText>
+              <w:instrText xml:space="preserve"> PAGEREF _Toc240577117 \h </w:instrText>
             </w:r>
             <w:r>
               <w:rPr>
@@ -3634,7 +3634,7 @@
               <w14:ligatures w14:val="standardContextual"/>
             </w:rPr>
           </w:pPr>
-          <w:hyperlink w:anchor="_Toc240576288" w:history="1">
+          <w:hyperlink w:anchor="_Toc240577118" w:history="1">
             <w:r>
               <w:rPr>
                 <w:rStyle w:val="Hyperlink"/>
@@ -3658,7 +3658,7 @@
               <w:rPr>
                 <w:noProof/>
               </w:rPr>
-              <w:instrText xml:space="preserve"> PAGEREF _Toc240576288 \h </w:instrText>
+              <w:instrText xml:space="preserve"> PAGEREF _Toc240577118 \h </w:instrText>
             </w:r>
             <w:r>
               <w:rPr>
@@ -3700,7 +3700,7 @@
               <w14:ligatures w14:val="standardContextual"/>
             </w:rPr>
           </w:pPr>
-          <w:hyperlink w:anchor="_Toc240576289" w:history="1">
+          <w:hyperlink w:anchor="_Toc240577119" w:history="1">
             <w:r>
               <w:rPr>
                 <w:rStyle w:val="Hyperlink"/>
@@ -3724,7 +3724,7 @@
               <w:rPr>
                 <w:noProof/>
               </w:rPr>
-              <w:instrText xml:space="preserve"> PAGEREF _Toc240576289 \h </w:instrText>
+              <w:instrText xml:space="preserve"> PAGEREF _Toc240577119 \h </w:instrText>
             </w:r>
             <w:r>
               <w:rPr>
@@ -3766,7 +3766,7 @@
               <w14:ligatures w14:val="standardContextual"/>
             </w:rPr>
           </w:pPr>
-          <w:hyperlink w:anchor="_Toc240576290" w:history="1">
+          <w:hyperlink w:anchor="_Toc240577120" w:history="1">
             <w:r>
               <w:rPr>
                 <w:rStyle w:val="Hyperlink"/>
@@ -3790,7 +3790,7 @@
               <w:rPr>
                 <w:noProof/>
               </w:rPr>
-              <w:instrText xml:space="preserve"> PAGEREF _Toc240576290 \h </w:instrText>
+              <w:instrText xml:space="preserve"> PAGEREF _Toc240577120 \h </w:instrText>
             </w:r>
             <w:r>
               <w:rPr>
@@ -3832,7 +3832,7 @@
               <w14:ligatures w14:val="standardContextual"/>
             </w:rPr>
           </w:pPr>
-          <w:hyperlink w:anchor="_Toc240576291" w:history="1">
+          <w:hyperlink w:anchor="_Toc240577121" w:history="1">
             <w:r>
               <w:rPr>
                 <w:rStyle w:val="Hyperlink"/>
@@ -3856,7 +3856,7 @@
               <w:rPr>
                 <w:noProof/>
               </w:rPr>
-              <w:instrText xml:space="preserve"> PAGEREF _Toc240576291 \h </w:instrText>
+              <w:instrText xml:space="preserve"> PAGEREF _Toc240577121 \h </w:instrText>
             </w:r>
             <w:r>
               <w:rPr>
@@ -3898,7 +3898,7 @@
               <w14:ligatures w14:val="standardContextual"/>
             </w:rPr>
           </w:pPr>
-          <w:hyperlink w:anchor="_Toc240576292" w:history="1">
+          <w:hyperlink w:anchor="_Toc240577122" w:history="1">
             <w:r>
               <w:rPr>
                 <w:rStyle w:val="Hyperlink"/>
@@ -3922,7 +3922,7 @@
               <w:rPr>
                 <w:noProof/>
               </w:rPr>
-              <w:instrText xml:space="preserve"> PAGEREF _Toc240576292 \h </w:instrText>
+              <w:instrText xml:space="preserve"> PAGEREF _Toc240577122 \h </w:instrText>
             </w:r>
             <w:r>
               <w:rPr>
@@ -3964,7 +3964,7 @@
               <w14:ligatures w14:val="standardContextual"/>
             </w:rPr>
           </w:pPr>
-          <w:hyperlink w:anchor="_Toc240576293" w:history="1">
+          <w:hyperlink w:anchor="_Toc240577123" w:history="1">
             <w:r>
               <w:rPr>
                 <w:rStyle w:val="Hyperlink"/>
@@ -3988,7 +3988,7 @@
               <w:rPr>
                 <w:noProof/>
               </w:rPr>
-              <w:instrText xml:space="preserve"> PAGEREF _Toc240576293 \h </w:instrText>
+              <w:instrText xml:space="preserve"> PAGEREF _Toc240577123 \h </w:instrText>
             </w:r>
             <w:r>
               <w:rPr>
@@ -4030,7 +4030,7 @@
               <w14:ligatures w14:val="standardContextual"/>
             </w:rPr>
           </w:pPr>
-          <w:hyperlink w:anchor="_Toc240576294" w:history="1">
+          <w:hyperlink w:anchor="_Toc240577124" w:history="1">
             <w:r>
               <w:rPr>
                 <w:rStyle w:val="Hyperlink"/>
@@ -4054,7 +4054,7 @@
               <w:rPr>
                 <w:noProof/>
               </w:rPr>
-              <w:instrText xml:space="preserve"> PAGEREF _Toc240576294 \h </w:instrText>
+              <w:instrText xml:space="preserve"> PAGEREF _Toc240577124 \h </w:instrText>
             </w:r>
             <w:r>
               <w:rPr>
@@ -4096,7 +4096,7 @@
               <w14:ligatures w14:val="standardContextual"/>
             </w:rPr>
           </w:pPr>
-          <w:hyperlink w:anchor="_Toc240576295" w:history="1">
+          <w:hyperlink w:anchor="_Toc240577125" w:history="1">
             <w:r>
               <w:rPr>
                 <w:rStyle w:val="Hyperlink"/>
@@ -4120,7 +4120,7 @@
               <w:rPr>
                 <w:noProof/>
               </w:rPr>
-              <w:instrText xml:space="preserve"> PAGEREF _Toc240576295 \h </w:instrText>
+              <w:instrText xml:space="preserve"> PAGEREF _Toc240577125 \h </w:instrText>
             </w:r>
             <w:r>
               <w:rPr>
@@ -4162,7 +4162,7 @@
               <w14:ligatures w14:val="standardContextual"/>
             </w:rPr>
           </w:pPr>
-          <w:hyperlink w:anchor="_Toc240576296" w:history="1">
+          <w:hyperlink w:anchor="_Toc240577126" w:history="1">
             <w:r>
               <w:rPr>
                 <w:rStyle w:val="Hyperlink"/>
@@ -4186,7 +4186,7 @@
               <w:rPr>
                 <w:noProof/>
               </w:rPr>
-              <w:instrText xml:space="preserve"> PAGEREF _Toc240576296 \h </w:instrText>
+              <w:instrText xml:space="preserve"> PAGEREF _Toc240577126 \h </w:instrText>
             </w:r>
             <w:r>
               <w:rPr>
@@ -4228,7 +4228,7 @@
               <w14:ligatures w14:val="standardContextual"/>
             </w:rPr>
           </w:pPr>
-          <w:hyperlink w:anchor="_Toc240576297" w:history="1">
+          <w:hyperlink w:anchor="_Toc240577127" w:history="1">
             <w:r>
               <w:rPr>
                 <w:rStyle w:val="Hyperlink"/>
@@ -4252,7 +4252,7 @@
               <w:rPr>
                 <w:noProof/>
               </w:rPr>
-              <w:instrText xml:space="preserve"> PAGEREF _Toc240576297 \h </w:instrText>
+              <w:instrText xml:space="preserve"> PAGEREF _Toc240577127 \h </w:instrText>
             </w:r>
             <w:r>
               <w:rPr>
@@ -4294,7 +4294,7 @@
               <w14:ligatures w14:val="standardContextual"/>
             </w:rPr>
           </w:pPr>
-          <w:hyperlink w:anchor="_Toc240576298" w:history="1">
+          <w:hyperlink w:anchor="_Toc240577128" w:history="1">
             <w:r>
               <w:rPr>
                 <w:rStyle w:val="Hyperlink"/>
@@ -4318,7 +4318,7 @@
               <w:rPr>
                 <w:noProof/>
               </w:rPr>
-              <w:instrText xml:space="preserve"> PAGEREF _Toc240576298 \h </w:instrText>
+              <w:instrText xml:space="preserve"> PAGEREF _Toc240577128 \h </w:instrText>
             </w:r>
             <w:r>
               <w:rPr>
@@ -4360,7 +4360,7 @@
               <w14:ligatures w14:val="standardContextual"/>
             </w:rPr>
           </w:pPr>
-          <w:hyperlink w:anchor="_Toc240576299" w:history="1">
+          <w:hyperlink w:anchor="_Toc240577129" w:history="1">
             <w:r>
               <w:rPr>
                 <w:rStyle w:val="Hyperlink"/>
@@ -4384,7 +4384,7 @@
               <w:rPr>
                 <w:noProof/>
               </w:rPr>
-              <w:instrText xml:space="preserve"> PAGEREF _Toc240576299 \h </w:instrText>
+              <w:instrText xml:space="preserve"> PAGEREF _Toc240577129 \h </w:instrText>
             </w:r>
             <w:r>
               <w:rPr>
@@ -4426,7 +4426,7 @@
               <w14:ligatures w14:val="standardContextual"/>
             </w:rPr>
           </w:pPr>
-          <w:hyperlink w:anchor="_Toc240576300" w:history="1">
+          <w:hyperlink w:anchor="_Toc240577130" w:history="1">
             <w:r>
               <w:rPr>
                 <w:rStyle w:val="Hyperlink"/>
@@ -4450,7 +4450,7 @@
               <w:rPr>
                 <w:noProof/>
               </w:rPr>
-              <w:instrText xml:space="preserve"> PAGEREF _Toc240576300 \h </w:instrText>
+              <w:instrText xml:space="preserve"> PAGEREF _Toc240577130 \h </w:instrText>
             </w:r>
             <w:r>
               <w:rPr>
@@ -4492,7 +4492,7 @@
               <w14:ligatures w14:val="standardContextual"/>
             </w:rPr>
           </w:pPr>
-          <w:hyperlink w:anchor="_Toc240576301" w:history="1">
+          <w:hyperlink w:anchor="_Toc240577131" w:history="1">
             <w:r>
               <w:rPr>
                 <w:rStyle w:val="Hyperlink"/>
@@ -4516,7 +4516,7 @@
               <w:rPr>
                 <w:noProof/>
               </w:rPr>
-              <w:instrText xml:space="preserve"> PAGEREF _Toc240576301 \h </w:instrText>
+              <w:instrText xml:space="preserve"> PAGEREF _Toc240577131 \h </w:instrText>
             </w:r>
             <w:r>
               <w:rPr>
@@ -4558,7 +4558,7 @@
               <w14:ligatures w14:val="standardContextual"/>
             </w:rPr>
           </w:pPr>
-          <w:hyperlink w:anchor="_Toc240576302" w:history="1">
+          <w:hyperlink w:anchor="_Toc240577132" w:history="1">
             <w:r>
               <w:rPr>
                 <w:rStyle w:val="Hyperlink"/>
@@ -4582,7 +4582,7 @@
               <w:rPr>
                 <w:noProof/>
               </w:rPr>
-              <w:instrText xml:space="preserve"> PAGEREF _Toc240576302 \h </w:instrText>
+              <w:instrText xml:space="preserve"> PAGEREF _Toc240577132 \h </w:instrText>
             </w:r>
             <w:r>
               <w:rPr>
@@ -4624,7 +4624,7 @@
               <w14:ligatures w14:val="standardContextual"/>
             </w:rPr>
           </w:pPr>
-          <w:hyperlink w:anchor="_Toc240576303" w:history="1">
+          <w:hyperlink w:anchor="_Toc240577133" w:history="1">
             <w:r>
               <w:rPr>
                 <w:rStyle w:val="Hyperlink"/>
@@ -4648,7 +4648,7 @@
               <w:rPr>
                 <w:noProof/>
               </w:rPr>
-              <w:instrText xml:space="preserve"> PAGEREF _Toc240576303 \h </w:instrText>
+              <w:instrText xml:space="preserve"> PAGEREF _Toc240577133 \h </w:instrText>
             </w:r>
             <w:r>
               <w:rPr>
@@ -4690,7 +4690,7 @@
               <w14:ligatures w14:val="standardContextual"/>
             </w:rPr>
           </w:pPr>
-          <w:hyperlink w:anchor="_Toc240576304" w:history="1">
+          <w:hyperlink w:anchor="_Toc240577134" w:history="1">
             <w:r>
               <w:rPr>
                 <w:rStyle w:val="Hyperlink"/>
@@ -4714,7 +4714,7 @@
               <w:rPr>
                 <w:noProof/>
               </w:rPr>
-              <w:instrText xml:space="preserve"> PAGEREF _Toc240576304 \h </w:instrText>
+              <w:instrText xml:space="preserve"> PAGEREF _Toc240577134 \h </w:instrText>
             </w:r>
             <w:r>
               <w:rPr>
@@ -4756,7 +4756,7 @@
               <w14:ligatures w14:val="standardContextual"/>
             </w:rPr>
           </w:pPr>
-          <w:hyperlink w:anchor="_Toc240576305" w:history="1">
+          <w:hyperlink w:anchor="_Toc240577135" w:history="1">
             <w:r>
               <w:rPr>
                 <w:rStyle w:val="Hyperlink"/>
@@ -4780,7 +4780,7 @@
               <w:rPr>
                 <w:noProof/>
               </w:rPr>
-              <w:instrText xml:space="preserve"> PAGEREF _Toc240576305 \h </w:instrText>
+              <w:instrText xml:space="preserve"> PAGEREF _Toc240577135 \h </w:instrText>
             </w:r>
             <w:r>
               <w:rPr>
@@ -4822,7 +4822,7 @@
               <w14:ligatures w14:val="standardContextual"/>
             </w:rPr>
           </w:pPr>
-          <w:hyperlink w:anchor="_Toc240576306" w:history="1">
+          <w:hyperlink w:anchor="_Toc240577136" w:history="1">
             <w:r>
               <w:rPr>
                 <w:rStyle w:val="Hyperlink"/>
@@ -4846,7 +4846,7 @@
               <w:rPr>
                 <w:noProof/>
               </w:rPr>
-              <w:instrText xml:space="preserve"> PAGEREF _Toc240576306 \h </w:instrText>
+              <w:instrText xml:space="preserve"> PAGEREF _Toc240577136 \h </w:instrText>
             </w:r>
             <w:r>
               <w:rPr>
@@ -4888,7 +4888,7 @@
               <w14:ligatures w14:val="standardContextual"/>
             </w:rPr>
           </w:pPr>
-          <w:hyperlink w:anchor="_Toc240576307" w:history="1">
+          <w:hyperlink w:anchor="_Toc240577137" w:history="1">
             <w:r>
               <w:rPr>
                 <w:rStyle w:val="Hyperlink"/>
@@ -4912,7 +4912,7 @@
               <w:rPr>
                 <w:noProof/>
               </w:rPr>
-              <w:instrText xml:space="preserve"> PAGEREF _Toc240576307 \h </w:instrText>
+              <w:instrText xml:space="preserve"> PAGEREF _Toc240577137 \h </w:instrText>
             </w:r>
             <w:r>
               <w:rPr>
@@ -4954,7 +4954,7 @@
               <w14:ligatures w14:val="standardContextual"/>
             </w:rPr>
           </w:pPr>
-          <w:hyperlink w:anchor="_Toc240576308" w:history="1">
+          <w:hyperlink w:anchor="_Toc240577138" w:history="1">
             <w:r>
               <w:rPr>
                 <w:rStyle w:val="Hyperlink"/>
@@ -4978,7 +4978,7 @@
               <w:rPr>
                 <w:noProof/>
               </w:rPr>
-              <w:instrText xml:space="preserve"> PAGEREF _Toc240576308 \h </w:instrText>
+              <w:instrText xml:space="preserve"> PAGEREF _Toc240577138 \h </w:instrText>
             </w:r>
             <w:r>
               <w:rPr>
@@ -5020,7 +5020,7 @@
               <w14:ligatures w14:val="standardContextual"/>
             </w:rPr>
           </w:pPr>
-          <w:hyperlink w:anchor="_Toc240576309" w:history="1">
+          <w:hyperlink w:anchor="_Toc240577139" w:history="1">
             <w:r>
               <w:rPr>
                 <w:rStyle w:val="Hyperlink"/>
@@ -5044,7 +5044,7 @@
               <w:rPr>
                 <w:noProof/>
               </w:rPr>
-              <w:instrText xml:space="preserve"> PAGEREF _Toc240576309 \h </w:instrText>
+              <w:instrText xml:space="preserve"> PAGEREF _Toc240577139 \h </w:instrText>
             </w:r>
             <w:r>
               <w:rPr>
@@ -5086,7 +5086,7 @@
               <w14:ligatures w14:val="standardContextual"/>
             </w:rPr>
           </w:pPr>
-          <w:hyperlink w:anchor="_Toc240576310" w:history="1">
+          <w:hyperlink w:anchor="_Toc240577140" w:history="1">
             <w:r>
               <w:rPr>
                 <w:rStyle w:val="Hyperlink"/>
@@ -5110,7 +5110,7 @@
               <w:rPr>
                 <w:noProof/>
               </w:rPr>
-              <w:instrText xml:space="preserve"> PAGEREF _Toc240576310 \h </w:instrText>
+              <w:instrText xml:space="preserve"> PAGEREF _Toc240577140 \h </w:instrText>
             </w:r>
             <w:r>
               <w:rPr>
@@ -5152,7 +5152,7 @@
               <w14:ligatures w14:val="standardContextual"/>
             </w:rPr>
           </w:pPr>
-          <w:hyperlink w:anchor="_Toc240576311" w:history="1">
+          <w:hyperlink w:anchor="_Toc240577141" w:history="1">
             <w:r>
               <w:rPr>
                 <w:rStyle w:val="Hyperlink"/>
@@ -5176,7 +5176,7 @@
               <w:rPr>
                 <w:noProof/>
               </w:rPr>
-              <w:instrText xml:space="preserve"> PAGEREF _Toc240576311 \h </w:instrText>
+              <w:instrText xml:space="preserve"> PAGEREF _Toc240577141 \h </w:instrText>
             </w:r>
             <w:r>
               <w:rPr>
@@ -5218,7 +5218,7 @@
               <w14:ligatures w14:val="standardContextual"/>
             </w:rPr>
           </w:pPr>
-          <w:hyperlink w:anchor="_Toc240576312" w:history="1">
+          <w:hyperlink w:anchor="_Toc240577142" w:history="1">
             <w:r>
               <w:rPr>
                 <w:rStyle w:val="Hyperlink"/>
@@ -5242,7 +5242,7 @@
               <w:rPr>
                 <w:noProof/>
               </w:rPr>
-              <w:instrText xml:space="preserve"> PAGEREF _Toc240576312 \h </w:instrText>
+              <w:instrText xml:space="preserve"> PAGEREF _Toc240577142 \h </w:instrText>
             </w:r>
             <w:r>
               <w:rPr>
@@ -5284,7 +5284,7 @@
               <w14:ligatures w14:val="standardContextual"/>
             </w:rPr>
           </w:pPr>
-          <w:hyperlink w:anchor="_Toc240576313" w:history="1">
+          <w:hyperlink w:anchor="_Toc240577143" w:history="1">
             <w:r>
               <w:rPr>
                 <w:rStyle w:val="Hyperlink"/>
@@ -5308,7 +5308,7 @@
               <w:rPr>
                 <w:noProof/>
               </w:rPr>
-              <w:instrText xml:space="preserve"> PAGEREF _Toc240576313 \h </w:instrText>
+              <w:instrText xml:space="preserve"> PAGEREF _Toc240577143 \h </w:instrText>
             </w:r>
             <w:r>
               <w:rPr>
@@ -5350,7 +5350,7 @@
               <w14:ligatures w14:val="standardContextual"/>
             </w:rPr>
           </w:pPr>
-          <w:hyperlink w:anchor="_Toc240576314" w:history="1">
+          <w:hyperlink w:anchor="_Toc240577144" w:history="1">
             <w:r>
               <w:rPr>
                 <w:rStyle w:val="Hyperlink"/>
@@ -5374,7 +5374,7 @@
               <w:rPr>
                 <w:noProof/>
               </w:rPr>
-              <w:instrText xml:space="preserve"> PAGEREF _Toc240576314 \h </w:instrText>
+              <w:instrText xml:space="preserve"> PAGEREF _Toc240577144 \h </w:instrText>
             </w:r>
             <w:r>
               <w:rPr>
@@ -5416,7 +5416,7 @@
               <w14:ligatures w14:val="standardContextual"/>
             </w:rPr>
           </w:pPr>
-          <w:hyperlink w:anchor="_Toc240576315" w:history="1">
+          <w:hyperlink w:anchor="_Toc240577145" w:history="1">
             <w:r>
               <w:rPr>
                 <w:rStyle w:val="Hyperlink"/>
@@ -5440,7 +5440,7 @@
               <w:rPr>
                 <w:noProof/>
               </w:rPr>
-              <w:instrText xml:space="preserve"> PAGEREF _Toc240576315 \h </w:instrText>
+              <w:instrText xml:space="preserve"> PAGEREF _Toc240577145 \h </w:instrText>
             </w:r>
             <w:r>
               <w:rPr>
@@ -5482,7 +5482,7 @@
               <w14:ligatures w14:val="standardContextual"/>
             </w:rPr>
           </w:pPr>
-          <w:hyperlink w:anchor="_Toc240576316" w:history="1">
+          <w:hyperlink w:anchor="_Toc240577146" w:history="1">
             <w:r>
               <w:rPr>
                 <w:rStyle w:val="Hyperlink"/>
@@ -5506,7 +5506,7 @@
               <w:rPr>
                 <w:noProof/>
               </w:rPr>
-              <w:instrText xml:space="preserve"> PAGEREF _Toc240576316 \h </w:instrText>
+              <w:instrText xml:space="preserve"> PAGEREF _Toc240577146 \h </w:instrText>
             </w:r>
             <w:r>
               <w:rPr>
@@ -5548,7 +5548,7 @@
               <w14:ligatures w14:val="standardContextual"/>
             </w:rPr>
           </w:pPr>
-          <w:hyperlink w:anchor="_Toc240576317" w:history="1">
+          <w:hyperlink w:anchor="_Toc240577147" w:history="1">
             <w:r>
               <w:rPr>
                 <w:rStyle w:val="Hyperlink"/>
@@ -5572,7 +5572,7 @@
               <w:rPr>
                 <w:noProof/>
               </w:rPr>
-              <w:instrText xml:space="preserve"> PAGEREF _Toc240576317 \h </w:instrText>
+              <w:instrText xml:space="preserve"> PAGEREF _Toc240577147 \h </w:instrText>
             </w:r>
             <w:r>
               <w:rPr>
@@ -5614,7 +5614,7 @@
               <w14:ligatures w14:val="standardContextual"/>
             </w:rPr>
           </w:pPr>
-          <w:hyperlink w:anchor="_Toc240576318" w:history="1">
+          <w:hyperlink w:anchor="_Toc240577148" w:history="1">
             <w:r>
               <w:rPr>
                 <w:rStyle w:val="Hyperlink"/>
@@ -5638,7 +5638,7 @@
               <w:rPr>
                 <w:noProof/>
               </w:rPr>
-              <w:instrText xml:space="preserve"> PAGEREF _Toc240576318 \h </w:instrText>
+              <w:instrText xml:space="preserve"> PAGEREF _Toc240577148 \h </w:instrText>
             </w:r>
             <w:r>
               <w:rPr>
@@ -5694,7 +5694,7 @@
       <w:pPr>
         <w:pStyle w:val="Kop1"/>
       </w:pPr>
-      <w:bookmarkStart w:id="2" w:name="_Toc240576249"/>
+      <w:bookmarkStart w:id="2" w:name="_Toc240577079"/>
       <w:r>
         <w:lastRenderedPageBreak/>
         <w:t>Quick Start Guide</w:t>
@@ -5835,7 +5835,7 @@
       <w:pPr>
         <w:pStyle w:val="Kop1"/>
       </w:pPr>
-      <w:bookmarkStart w:id="3" w:name="_Toc240576250"/>
+      <w:bookmarkStart w:id="3" w:name="_Toc240577080"/>
       <w:r>
         <w:lastRenderedPageBreak/>
         <w:t>Part I: Introduction to Non-Compartmental Analysis</w:t>
@@ -5846,7 +5846,7 @@
       <w:pPr>
         <w:pStyle w:val="Kop2"/>
       </w:pPr>
-      <w:bookmarkStart w:id="4" w:name="_Toc240576251"/>
+      <w:bookmarkStart w:id="4" w:name="_Toc240577081"/>
       <w:r>
         <w:t>What Is Non-Compartmental Analysis?</w:t>
       </w:r>
@@ -5872,7 +5872,7 @@
       <w:pPr>
         <w:pStyle w:val="Kop2"/>
       </w:pPr>
-      <w:bookmarkStart w:id="5" w:name="_Toc240576252"/>
+      <w:bookmarkStart w:id="5" w:name="_Toc240577082"/>
       <w:r>
         <w:t>The Concentration–Time Curve</w:t>
       </w:r>
@@ -5890,7 +5890,7 @@
       <w:pPr>
         <w:pStyle w:val="Kop2"/>
       </w:pPr>
-      <w:bookmarkStart w:id="6" w:name="_Toc240576253"/>
+      <w:bookmarkStart w:id="6" w:name="_Toc240577083"/>
       <w:r>
         <w:t>Key Pharmacokinetic Parameters</w:t>
       </w:r>
@@ -6575,7 +6575,7 @@
       <w:pPr>
         <w:pStyle w:val="Kop2"/>
       </w:pPr>
-      <w:bookmarkStart w:id="7" w:name="_Toc240576254"/>
+      <w:bookmarkStart w:id="7" w:name="_Toc240577084"/>
       <w:r>
         <w:t>Why NCA Is Used So Widely</w:t>
       </w:r>
@@ -6610,7 +6610,7 @@
       <w:pPr>
         <w:pStyle w:val="Kop2"/>
       </w:pPr>
-      <w:bookmarkStart w:id="8" w:name="_Toc240576255"/>
+      <w:bookmarkStart w:id="8" w:name="_Toc240577085"/>
       <w:r>
         <w:t>When to Use NCA vs. Compartmental Modelling</w:t>
       </w:r>
@@ -6634,7 +6634,7 @@
       <w:pPr>
         <w:pStyle w:val="Kop1"/>
       </w:pPr>
-      <w:bookmarkStart w:id="9" w:name="_Toc240576256"/>
+      <w:bookmarkStart w:id="9" w:name="_Toc240577086"/>
       <w:r>
         <w:lastRenderedPageBreak/>
         <w:t>Part II: Preparing Your Data</w:t>
@@ -6645,7 +6645,7 @@
       <w:pPr>
         <w:pStyle w:val="Kop2"/>
       </w:pPr>
-      <w:bookmarkStart w:id="10" w:name="_Toc240576257"/>
+      <w:bookmarkStart w:id="10" w:name="_Toc240577087"/>
       <w:r>
         <w:t>General Format Rules</w:t>
       </w:r>
@@ -6673,7 +6673,7 @@
       <w:pPr>
         <w:pStyle w:val="Kop3"/>
       </w:pPr>
-      <w:bookmarkStart w:id="11" w:name="_Toc240576258"/>
+      <w:bookmarkStart w:id="11" w:name="_Toc240577088"/>
       <w:r>
         <w:t>Decimal Separators and Regional Formats</w:t>
       </w:r>
@@ -6699,7 +6699,7 @@
       <w:pPr>
         <w:pStyle w:val="Kop2"/>
       </w:pPr>
-      <w:bookmarkStart w:id="12" w:name="_Toc240576259"/>
+      <w:bookmarkStart w:id="12" w:name="_Toc240577089"/>
       <w:r>
         <w:t>Scenario 1: Single Subject</w:t>
       </w:r>
@@ -7392,7 +7392,7 @@
       <w:pPr>
         <w:pStyle w:val="Kop2"/>
       </w:pPr>
-      <w:bookmarkStart w:id="13" w:name="_Toc240576260"/>
+      <w:bookmarkStart w:id="13" w:name="_Toc240577090"/>
       <w:r>
         <w:t>Scenario 2: Multiple Subjects, Same Dose</w:t>
       </w:r>
@@ -7997,7 +7997,7 @@
       <w:pPr>
         <w:pStyle w:val="Kop2"/>
       </w:pPr>
-      <w:bookmarkStart w:id="14" w:name="_Toc240576261"/>
+      <w:bookmarkStart w:id="14" w:name="_Toc240577091"/>
       <w:r>
         <w:lastRenderedPageBreak/>
         <w:t>Scenario 3: Multiple Subjects, Different Doses</w:t>
@@ -8016,7 +8016,7 @@
       <w:pPr>
         <w:pStyle w:val="Kop2"/>
       </w:pPr>
-      <w:bookmarkStart w:id="15" w:name="_Toc240576262"/>
+      <w:bookmarkStart w:id="15" w:name="_Toc240577092"/>
       <w:r>
         <w:t>Scenario 4: Standard 2-Period Crossover (BE)</w:t>
       </w:r>
@@ -8874,7 +8874,7 @@
       <w:pPr>
         <w:pStyle w:val="Kop2"/>
       </w:pPr>
-      <w:bookmarkStart w:id="16" w:name="_Toc240576263"/>
+      <w:bookmarkStart w:id="16" w:name="_Toc240577093"/>
       <w:r>
         <w:t>Scenario 5: Replicate Designs and Paired Comparison</w:t>
       </w:r>
@@ -8892,7 +8892,7 @@
       <w:pPr>
         <w:pStyle w:val="Kop2"/>
       </w:pPr>
-      <w:bookmarkStart w:id="17" w:name="_Toc240576264"/>
+      <w:bookmarkStart w:id="17" w:name="_Toc240577094"/>
       <w:r>
         <w:t>Scenario 6: Parallel-Group BE</w:t>
       </w:r>
@@ -8910,7 +8910,7 @@
       <w:pPr>
         <w:pStyle w:val="Kop2"/>
       </w:pPr>
-      <w:bookmarkStart w:id="18" w:name="_Toc240576265"/>
+      <w:bookmarkStart w:id="18" w:name="_Toc240577095"/>
       <w:r>
         <w:t>Scenario 7: Steady-State PK</w:t>
       </w:r>
@@ -8928,7 +8928,7 @@
       <w:pPr>
         <w:pStyle w:val="Kop2"/>
       </w:pPr>
-      <w:bookmarkStart w:id="19" w:name="_Toc240576266"/>
+      <w:bookmarkStart w:id="19" w:name="_Toc240577096"/>
       <w:r>
         <w:t>Scenario 8: Drug–Drug Interaction Study</w:t>
       </w:r>
@@ -8955,7 +8955,7 @@
       <w:pPr>
         <w:pStyle w:val="Kop2"/>
       </w:pPr>
-      <w:bookmarkStart w:id="20" w:name="_Toc240576267"/>
+      <w:bookmarkStart w:id="20" w:name="_Toc240577097"/>
       <w:r>
         <w:t>Scenario 9: CDISC ADNCA Dataset</w:t>
       </w:r>
@@ -8973,7 +8973,7 @@
       <w:pPr>
         <w:pStyle w:val="Kop2"/>
       </w:pPr>
-      <w:bookmarkStart w:id="21" w:name="_Toc240576268"/>
+      <w:bookmarkStart w:id="21" w:name="_Toc240577098"/>
       <w:r>
         <w:t>BLQ Handling</w:t>
       </w:r>
@@ -9404,7 +9404,7 @@
       <w:pPr>
         <w:pStyle w:val="Kop2"/>
       </w:pPr>
-      <w:bookmarkStart w:id="22" w:name="_Toc240576269"/>
+      <w:bookmarkStart w:id="22" w:name="_Toc240577099"/>
       <w:r>
         <w:t>Common Mistakes</w:t>
       </w:r>
@@ -9515,7 +9515,7 @@
       <w:pPr>
         <w:pStyle w:val="Kop1"/>
       </w:pPr>
-      <w:bookmarkStart w:id="23" w:name="_Toc240576270"/>
+      <w:bookmarkStart w:id="23" w:name="_Toc240577100"/>
       <w:r>
         <w:lastRenderedPageBreak/>
         <w:t>Part III: Using the App</w:t>
@@ -9526,7 +9526,7 @@
       <w:pPr>
         <w:pStyle w:val="Kop2"/>
       </w:pPr>
-      <w:bookmarkStart w:id="24" w:name="_Toc240576271"/>
+      <w:bookmarkStart w:id="24" w:name="_Toc240577101"/>
       <w:r>
         <w:t>The Hub Screen</w:t>
       </w:r>
@@ -9544,7 +9544,7 @@
       <w:pPr>
         <w:pStyle w:val="Kop2"/>
       </w:pPr>
-      <w:bookmarkStart w:id="25" w:name="_Toc240576272"/>
+      <w:bookmarkStart w:id="25" w:name="_Toc240577102"/>
       <w:r>
         <w:t>Path 1: Plan a Study</w:t>
       </w:r>
@@ -9570,7 +9570,7 @@
       <w:pPr>
         <w:pStyle w:val="Kop2"/>
       </w:pPr>
-      <w:bookmarkStart w:id="26" w:name="_Toc240576273"/>
+      <w:bookmarkStart w:id="26" w:name="_Toc240577103"/>
       <w:r>
         <w:t>Path 2: Upload &amp; Check Data</w:t>
       </w:r>
@@ -9588,7 +9588,7 @@
       <w:pPr>
         <w:pStyle w:val="Kop2"/>
       </w:pPr>
-      <w:bookmarkStart w:id="27" w:name="_Toc240576274"/>
+      <w:bookmarkStart w:id="27" w:name="_Toc240577104"/>
       <w:r>
         <w:t>Path 3: Visualize Data</w:t>
       </w:r>
@@ -9614,7 +9614,7 @@
       <w:pPr>
         <w:pStyle w:val="Kop3"/>
       </w:pPr>
-      <w:bookmarkStart w:id="28" w:name="_Toc240576275"/>
+      <w:bookmarkStart w:id="28" w:name="_Toc240577105"/>
       <w:r>
         <w:t>Plot Types</w:t>
       </w:r>
@@ -9644,7 +9644,7 @@
       <w:pPr>
         <w:pStyle w:val="Kop3"/>
       </w:pPr>
-      <w:bookmarkStart w:id="29" w:name="_Toc240576276"/>
+      <w:bookmarkStart w:id="29" w:name="_Toc240577106"/>
       <w:r>
         <w:t>Sidebar Controls</w:t>
       </w:r>
@@ -9694,7 +9694,7 @@
       <w:pPr>
         <w:pStyle w:val="Kop3"/>
       </w:pPr>
-      <w:bookmarkStart w:id="30" w:name="_Toc240576277"/>
+      <w:bookmarkStart w:id="30" w:name="_Toc240577107"/>
       <w:r>
         <w:t>Suggested Figure Legend</w:t>
       </w:r>
@@ -9712,7 +9712,7 @@
       <w:pPr>
         <w:pStyle w:val="Kop3"/>
       </w:pPr>
-      <w:bookmarkStart w:id="31" w:name="_Toc240576278"/>
+      <w:bookmarkStart w:id="31" w:name="_Toc240577108"/>
       <w:r>
         <w:t>Exporting a Figure</w:t>
       </w:r>
@@ -9742,7 +9742,7 @@
       <w:pPr>
         <w:pStyle w:val="Kop3"/>
       </w:pPr>
-      <w:bookmarkStart w:id="32" w:name="_Toc240576279"/>
+      <w:bookmarkStart w:id="32" w:name="_Toc240577109"/>
       <w:r>
         <w:t>Interactive Preview vs. Static Export</w:t>
       </w:r>
@@ -9760,7 +9760,7 @@
       <w:pPr>
         <w:pStyle w:val="Kop3"/>
       </w:pPr>
-      <w:bookmarkStart w:id="33" w:name="_Toc240576280"/>
+      <w:bookmarkStart w:id="33" w:name="_Toc240577110"/>
       <w:r>
         <w:t>Worked Examples</w:t>
       </w:r>
@@ -9815,7 +9815,7 @@
       <w:pPr>
         <w:pStyle w:val="Kop3"/>
       </w:pPr>
-      <w:bookmarkStart w:id="34" w:name="_Toc240576281"/>
+      <w:bookmarkStart w:id="34" w:name="_Toc240577111"/>
       <w:r>
         <w:t>Common Questions</w:t>
       </w:r>
@@ -9886,7 +9886,7 @@
       <w:pPr>
         <w:pStyle w:val="Kop2"/>
       </w:pPr>
-      <w:bookmarkStart w:id="35" w:name="_Toc240576282"/>
+      <w:bookmarkStart w:id="35" w:name="_Toc240577112"/>
       <w:r>
         <w:t>Path 4: One Subject at a Time</w:t>
       </w:r>
@@ -9904,7 +9904,7 @@
       <w:pPr>
         <w:pStyle w:val="Kop2"/>
       </w:pPr>
-      <w:bookmarkStart w:id="36" w:name="_Toc240576283"/>
+      <w:bookmarkStart w:id="36" w:name="_Toc240577113"/>
       <w:r>
         <w:t>Path 5: All Subjects (Batch)</w:t>
       </w:r>
@@ -9922,7 +9922,7 @@
       <w:pPr>
         <w:pStyle w:val="Kop2"/>
       </w:pPr>
-      <w:bookmarkStart w:id="37" w:name="_Toc240576284"/>
+      <w:bookmarkStart w:id="37" w:name="_Toc240577114"/>
       <w:r>
         <w:t>Path 6: Bioequivalence</w:t>
       </w:r>
@@ -9933,7 +9933,7 @@
         <w:spacing w:after="120" w:line="276" w:lineRule="auto"/>
       </w:pPr>
       <w:r>
-        <w:t>Runs the NCA, then the ANOVA, then the confidence interval (90% by default) and a forest plot. Choose the design: 2×2 standard crossover, 2×2×3 or 2×2×4 full replicate, 2×3×3 partial replicate, parallel groups, or paired comparison. Choose the Reference treatment (the ratio is Test ÷ Reference); the run is blocked until one is chosen, and the results table shows the comparison, for example “New / Old”. The model has Sequence, Subject, Period and Treatment as factors. With fixed effects this is EMA Method A; with mixed effects Subject is a random effect. The Model column says which was fitted. The verdict uses confidence limits rounded to two decimals. With limits wider than 80–125% the point estimate must also lie within 80.00–125.00%, unless you untick that (only for comparisons without such a rule, such as drug-interaction no-effect boundaries). Tmax, untransformed parameters and paired comparisons get a ratio or difference but no verdict. If all subjects received the treatments in the same order, the data are analysed as a paired comparison. For replicate designs a table shows the within-subject variability of the Reference (and of the Test when replicated) and the EMA widened limits it would imply, for information only: the app does not issue a scaled (ABEL or RSABE) verdict. A design summary and an amber warning for subjects missing a treatment appear after the NCA. Tick “Steady-state (drug given repeatedly)” for steady-state data; AUCτ then replaces AUC∞.</w:t>
+        <w:t>Runs the NCA, then the ANOVA, then the confidence interval (90% by default) and a forest plot. Choose the design: 2×2 standard crossover, 2×2×3 or 2×2×4 full replicate, 2×3×3 partial replicate, parallel groups, or paired comparison. Choose the Reference treatment (the ratio is Test ÷ Reference); the run is blocked until one is chosen, and the results table shows the comparison, for example “New / Old”. The model has Sequence, Subject, Period and Treatment as factors. With fixed effects this is EMA Method A; with mixed effects Subject is a random effect. The Model column says which was fitted. The verdict uses confidence limits rounded to two decimals. With limits wider than 80–125% the point estimate must also lie within 80.00–125.00%, unless you untick that (only for comparisons without such a rule, such as drug-interaction no-effect boundaries). Half-life gets a ratio with its confidence interval but no verdict, because it is not a bioequivalence endpoint; Tmax, untransformed parameters and paired comparisons also get no verdict. If all subjects received the treatments in the same order, the data are analysed as a paired comparison. For replicate designs a table shows the within-subject variability of the Reference (and of the Test when replicated) and the EMA widened limits it would imply, for information only: the app does not issue a scaled (ABEL or RSABE) verdict. A design summary and an amber warning for subjects missing a treatment appear after the NCA. Tick “Steady-state (drug given repeatedly)” for steady-state data; AUCτ then replaces AUC∞.</w:t>
       </w:r>
     </w:p>
     <w:p>
@@ -9952,7 +9952,7 @@
       <w:pPr>
         <w:pStyle w:val="Kop2"/>
       </w:pPr>
-      <w:bookmarkStart w:id="38" w:name="_Toc240576285"/>
+      <w:bookmarkStart w:id="38" w:name="_Toc240577115"/>
       <w:r>
         <w:t>Analysing Drug–Drug Interaction Studies</w:t>
       </w:r>
@@ -9970,7 +9970,7 @@
       <w:pPr>
         <w:pStyle w:val="Kop3"/>
       </w:pPr>
-      <w:bookmarkStart w:id="39" w:name="_Toc240576286"/>
+      <w:bookmarkStart w:id="39" w:name="_Toc240577116"/>
       <w:r>
         <w:t>How to Set Up a DDI Analysis</w:t>
       </w:r>
@@ -9996,7 +9996,7 @@
       <w:pPr>
         <w:pStyle w:val="Kop3"/>
       </w:pPr>
-      <w:bookmarkStart w:id="40" w:name="_Toc240576287"/>
+      <w:bookmarkStart w:id="40" w:name="_Toc240577117"/>
       <w:r>
         <w:t>Interpreting DDI Results</w:t>
       </w:r>
@@ -10040,7 +10040,7 @@
       <w:pPr>
         <w:pStyle w:val="Kop3"/>
       </w:pPr>
-      <w:bookmarkStart w:id="41" w:name="_Toc240576288"/>
+      <w:bookmarkStart w:id="41" w:name="_Toc240577118"/>
       <w:r>
         <w:t>Practical Considerations</w:t>
       </w:r>
@@ -10074,7 +10074,7 @@
       <w:pPr>
         <w:pStyle w:val="Kop2"/>
       </w:pPr>
-      <w:bookmarkStart w:id="42" w:name="_Toc240576289"/>
+      <w:bookmarkStart w:id="42" w:name="_Toc240577119"/>
       <w:r>
         <w:t>Complete Analysis Record</w:t>
       </w:r>
@@ -10101,7 +10101,7 @@
       <w:pPr>
         <w:pStyle w:val="Kop1"/>
       </w:pPr>
-      <w:bookmarkStart w:id="43" w:name="_Toc240576290"/>
+      <w:bookmarkStart w:id="43" w:name="_Toc240577120"/>
       <w:r>
         <w:lastRenderedPageBreak/>
         <w:t>Part IV: Worked Examples</w:t>
@@ -10112,7 +10112,7 @@
       <w:pPr>
         <w:pStyle w:val="Kop2"/>
       </w:pPr>
-      <w:bookmarkStart w:id="44" w:name="_Toc240576291"/>
+      <w:bookmarkStart w:id="44" w:name="_Toc240577121"/>
       <w:r>
         <w:t>Exercise 1: Theoph Dataset (Batch NCA)</w:t>
       </w:r>
@@ -10207,7 +10207,7 @@
       <w:pPr>
         <w:pStyle w:val="Kop2"/>
       </w:pPr>
-      <w:bookmarkStart w:id="45" w:name="_Toc240576292"/>
+      <w:bookmarkStart w:id="45" w:name="_Toc240577122"/>
       <w:r>
         <w:t>Exercise 2: Bioequivalence</w:t>
       </w:r>
@@ -10273,7 +10273,7 @@
       <w:pPr>
         <w:pStyle w:val="Kop2"/>
       </w:pPr>
-      <w:bookmarkStart w:id="46" w:name="_Toc240576293"/>
+      <w:bookmarkStart w:id="46" w:name="_Toc240577123"/>
       <w:r>
         <w:t>Exercise 3: Power Calculation</w:t>
       </w:r>
@@ -10324,7 +10324,7 @@
       <w:pPr>
         <w:pStyle w:val="Kop1"/>
       </w:pPr>
-      <w:bookmarkStart w:id="47" w:name="_Toc240576294"/>
+      <w:bookmarkStart w:id="47" w:name="_Toc240577124"/>
       <w:r>
         <w:lastRenderedPageBreak/>
         <w:t>Part V: Theoretical Background</w:t>
@@ -10335,7 +10335,7 @@
       <w:pPr>
         <w:pStyle w:val="Kop2"/>
       </w:pPr>
-      <w:bookmarkStart w:id="48" w:name="_Toc240576295"/>
+      <w:bookmarkStart w:id="48" w:name="_Toc240577125"/>
       <w:r>
         <w:t>Trapezoidal Methods for AUC Calculation</w:t>
       </w:r>
@@ -10345,7 +10345,7 @@
       <w:pPr>
         <w:pStyle w:val="Kop3"/>
       </w:pPr>
-      <w:bookmarkStart w:id="49" w:name="_Toc240576296"/>
+      <w:bookmarkStart w:id="49" w:name="_Toc240577126"/>
       <w:r>
         <w:t>The Linear Trapezoidal Rule</w:t>
       </w:r>
@@ -10422,7 +10422,7 @@
       <w:pPr>
         <w:pStyle w:val="Kop3"/>
       </w:pPr>
-      <w:bookmarkStart w:id="50" w:name="_Toc240576297"/>
+      <w:bookmarkStart w:id="50" w:name="_Toc240577127"/>
       <w:r>
         <w:t>The Logarithmic Trapezoidal Rule</w:t>
       </w:r>
@@ -10463,7 +10463,7 @@
       <w:pPr>
         <w:pStyle w:val="Kop3"/>
       </w:pPr>
-      <w:bookmarkStart w:id="51" w:name="_Toc240576298"/>
+      <w:bookmarkStart w:id="51" w:name="_Toc240577128"/>
       <w:r>
         <w:t>The Linear-Up / Log-Down Hybrid</w:t>
       </w:r>
@@ -10481,7 +10481,7 @@
       <w:pPr>
         <w:pStyle w:val="Kop2"/>
       </w:pPr>
-      <w:bookmarkStart w:id="52" w:name="_Toc240576299"/>
+      <w:bookmarkStart w:id="52" w:name="_Toc240577129"/>
       <w:r>
         <w:t>Terminal Phase Characterisation and Half-Life Estimation</w:t>
       </w:r>
@@ -10491,7 +10491,7 @@
       <w:pPr>
         <w:pStyle w:val="Kop3"/>
       </w:pPr>
-      <w:bookmarkStart w:id="53" w:name="_Toc240576300"/>
+      <w:bookmarkStart w:id="53" w:name="_Toc240577130"/>
       <w:r>
         <w:t>What Is the Terminal Phase?</w:t>
       </w:r>
@@ -10554,7 +10554,7 @@
       <w:pPr>
         <w:pStyle w:val="Kop3"/>
       </w:pPr>
-      <w:bookmarkStart w:id="54" w:name="_Toc240576301"/>
+      <w:bookmarkStart w:id="54" w:name="_Toc240577131"/>
       <w:r>
         <w:t>Automated Point Selection</w:t>
       </w:r>
@@ -10572,7 +10572,7 @@
       <w:pPr>
         <w:pStyle w:val="Kop3"/>
       </w:pPr>
-      <w:bookmarkStart w:id="55" w:name="_Toc240576302"/>
+      <w:bookmarkStart w:id="55" w:name="_Toc240577132"/>
       <w:r>
         <w:t>Manual Point Selection</w:t>
       </w:r>
@@ -10594,7 +10594,7 @@
       <w:pPr>
         <w:pStyle w:val="Kop2"/>
       </w:pPr>
-      <w:bookmarkStart w:id="56" w:name="_Toc240576303"/>
+      <w:bookmarkStart w:id="56" w:name="_Toc240577133"/>
       <w:r>
         <w:t>BLQ Handling: Pharmacological Rationale</w:t>
       </w:r>
@@ -10612,7 +10612,7 @@
       <w:pPr>
         <w:pStyle w:val="Kop2"/>
       </w:pPr>
-      <w:bookmarkStart w:id="57" w:name="_Toc240576304"/>
+      <w:bookmarkStart w:id="57" w:name="_Toc240577134"/>
       <w:r>
         <w:t>Steady-State Considerations</w:t>
       </w:r>
@@ -10635,7 +10635,7 @@
       <w:pPr>
         <w:pStyle w:val="Kop1"/>
       </w:pPr>
-      <w:bookmarkStart w:id="58" w:name="_Toc240576305"/>
+      <w:bookmarkStart w:id="58" w:name="_Toc240577135"/>
       <w:r>
         <w:lastRenderedPageBreak/>
         <w:t>Part VI: Statistical Methods</w:t>
@@ -10646,7 +10646,7 @@
       <w:pPr>
         <w:pStyle w:val="Kop2"/>
       </w:pPr>
-      <w:bookmarkStart w:id="59" w:name="_Toc240576306"/>
+      <w:bookmarkStart w:id="59" w:name="_Toc240577136"/>
       <w:r>
         <w:t>The Two One-Sided Tests (TOST) Procedure</w:t>
       </w:r>
@@ -10729,7 +10729,7 @@
       <w:pPr>
         <w:pStyle w:val="Kop2"/>
       </w:pPr>
-      <w:bookmarkStart w:id="60" w:name="_Toc240576307"/>
+      <w:bookmarkStart w:id="60" w:name="_Toc240577137"/>
       <w:r>
         <w:t>The ANOVA Model for Crossover Designs</w:t>
       </w:r>
@@ -10770,7 +10770,7 @@
       <w:pPr>
         <w:pStyle w:val="Kop2"/>
       </w:pPr>
-      <w:bookmarkStart w:id="61" w:name="_Toc240576308"/>
+      <w:bookmarkStart w:id="61" w:name="_Toc240577138"/>
       <w:r>
         <w:t>Fixed-Effects vs. Mixed-Effects Models</w:t>
       </w:r>
@@ -10796,7 +10796,7 @@
       <w:pPr>
         <w:pStyle w:val="Kop2"/>
       </w:pPr>
-      <w:bookmarkStart w:id="62" w:name="_Toc240576309"/>
+      <w:bookmarkStart w:id="62" w:name="_Toc240577139"/>
       <w:r>
         <w:t>Confidence Interval Construction</w:t>
       </w:r>
@@ -10829,7 +10829,7 @@
       <w:pPr>
         <w:pStyle w:val="Kop2"/>
       </w:pPr>
-      <w:bookmarkStart w:id="63" w:name="_Toc240576310"/>
+      <w:bookmarkStart w:id="63" w:name="_Toc240577140"/>
       <w:r>
         <w:t>Design-Specific Models</w:t>
       </w:r>
@@ -10903,7 +10903,7 @@
       <w:pPr>
         <w:pStyle w:val="Kop2"/>
       </w:pPr>
-      <w:bookmarkStart w:id="64" w:name="_Toc240576311"/>
+      <w:bookmarkStart w:id="64" w:name="_Toc240577141"/>
       <w:r>
         <w:t>Drug–Drug Interaction Analysis</w:t>
       </w:r>
@@ -10929,7 +10929,7 @@
       <w:pPr>
         <w:pStyle w:val="Kop2"/>
       </w:pPr>
-      <w:bookmarkStart w:id="65" w:name="_Toc240576312"/>
+      <w:bookmarkStart w:id="65" w:name="_Toc240577142"/>
       <w:r>
         <w:t>Power and Sample Size for Bioequivalence</w:t>
       </w:r>
@@ -10960,7 +10960,7 @@
       <w:pPr>
         <w:pStyle w:val="Kop2"/>
       </w:pPr>
-      <w:bookmarkStart w:id="66" w:name="_Toc240576313"/>
+      <w:bookmarkStart w:id="66" w:name="_Toc240577143"/>
       <w:r>
         <w:t>Regulatory Guidelines</w:t>
       </w:r>
@@ -11050,7 +11050,7 @@
       <w:pPr>
         <w:pStyle w:val="Kop1"/>
       </w:pPr>
-      <w:bookmarkStart w:id="67" w:name="_Toc240576314"/>
+      <w:bookmarkStart w:id="67" w:name="_Toc240577144"/>
       <w:r>
         <w:lastRenderedPageBreak/>
         <w:t>Appendices</w:t>
@@ -11061,7 +11061,7 @@
       <w:pPr>
         <w:pStyle w:val="Kop2"/>
       </w:pPr>
-      <w:bookmarkStart w:id="68" w:name="_Toc240576315"/>
+      <w:bookmarkStart w:id="68" w:name="_Toc240577145"/>
       <w:r>
         <w:t>Appendix A: Glossary</w:t>
       </w:r>
@@ -12559,7 +12559,7 @@
       <w:pPr>
         <w:pStyle w:val="Kop2"/>
       </w:pPr>
-      <w:bookmarkStart w:id="69" w:name="_Toc240576316"/>
+      <w:bookmarkStart w:id="69" w:name="_Toc240577146"/>
       <w:r>
         <w:t>Appendix B: Recognised Column Names</w:t>
       </w:r>
@@ -13040,7 +13040,7 @@
       <w:pPr>
         <w:pStyle w:val="Kop2"/>
       </w:pPr>
-      <w:bookmarkStart w:id="70" w:name="_Toc240576317"/>
+      <w:bookmarkStart w:id="70" w:name="_Toc240577147"/>
       <w:r>
         <w:t>Appendix C: Troubleshooting</w:t>
       </w:r>
@@ -13200,7 +13200,7 @@
       <w:pPr>
         <w:pStyle w:val="Kop2"/>
       </w:pPr>
-      <w:bookmarkStart w:id="71" w:name="_Toc240576318"/>
+      <w:bookmarkStart w:id="71" w:name="_Toc240577148"/>
       <w:r>
         <w:t>Appendix D: References</w:t>
       </w:r>

</xml_diff>